<commit_message>
feat: add all project files, scratch scripts, and auditdok project to repo
</commit_message>
<xml_diff>
--- a/projects/makalah-sim/MAKALAH_SIM_AJIE_BARIANDONO_2110426823.docx
+++ b/projects/makalah-sim/MAKALAH_SIM_AJIE_BARIANDONO_2110426823.docx
@@ -404,7 +404,7 @@
           <w:sz w:val="24"/>
           <w:szCs w:val="24"/>
         </w:rPr>
-        <w:t xml:space="preserve">Ibu Endang Kristiawati, S.E., Ak., M.Si selaku Dosen Pengampu mata kuliah Sistem Informasi Manajemen yang telah memberikan bimbingan dan arahan.</w:t>
+        <w:t xml:space="preserve">Ibu Dr. Renny Wulandari, S.E., M.Si., Ak., CA selaku Dosen Pengampu mata kuliah Sistem Informasi Manajemen yang telah memberikan bimbingan dan arahan.</w:t>
       </w:r>
     </w:p>
     <w:p>
@@ -428,25 +428,6 @@
     </w:p>
     <w:p>
       <w:pPr>
-        <w:pStyle w:val="ListParagraph"/>
-        <w:numPr>
-          <w:ilvl w:val="0"/>
-          <w:numId w:val="2"/>
-        </w:numPr>
-        <w:spacing w:after="0" w:before="0" w:line="480"/>
-        <w:jc w:val="both"/>
-      </w:pPr>
-      <w:r>
-        <w:rPr>
-          <w:rFonts w:ascii="Times New Roman" w:cs="Times New Roman" w:eastAsia="Times New Roman" w:hAnsi="Times New Roman"/>
-          <w:sz w:val="24"/>
-          <w:szCs w:val="24"/>
-        </w:rPr>
-        <w:t xml:space="preserve">Rekan-rekan mahasiswa serta semua pihak yang telah memberikan dukungan dalam penyelesaian makalah ini.</w:t>
-      </w:r>
-    </w:p>
-    <w:p>
-      <w:pPr>
         <w:spacing w:after="0" w:before="0" w:line="360"/>
       </w:pPr>
       <w:r>
@@ -476,42 +457,64 @@
         <w:t xml:space="preserve"/>
       </w:r>
     </w:p>
-    <w:p>
-      <w:pPr>
-        <w:spacing w:after="0" w:before="0" w:line="480"/>
-        <w:jc w:val="right"/>
-      </w:pPr>
-      <w:r>
-        <w:rPr>
-          <w:rFonts w:ascii="Times New Roman" w:cs="Times New Roman" w:eastAsia="Times New Roman" w:hAnsi="Times New Roman"/>
-          <w:sz w:val="24"/>
-          <w:szCs w:val="24"/>
-        </w:rPr>
-        <w:t xml:space="preserve">Pontianak, Juni 2026</w:t>
-      </w:r>
-    </w:p>
-    <w:p>
-      <w:pPr>
-        <w:spacing w:after="0" w:before="0" w:line="360"/>
-      </w:pPr>
-      <w:r>
-        <w:t xml:space="preserve"/>
-      </w:r>
-    </w:p>
-    <w:p>
-      <w:pPr>
-        <w:spacing w:after="0" w:before="0" w:line="480"/>
-        <w:jc w:val="right"/>
-      </w:pPr>
-      <w:r>
-        <w:rPr>
-          <w:rFonts w:ascii="Times New Roman" w:cs="Times New Roman" w:eastAsia="Times New Roman" w:hAnsi="Times New Roman"/>
-          <w:sz w:val="24"/>
-          <w:szCs w:val="24"/>
-        </w:rPr>
-        <w:t xml:space="preserve">Penulis</w:t>
-      </w:r>
-    </w:p>
+    <w:tbl>
+      <w:tblPr>
+        <w:tblW w:type="dxa" w:w="3254"/>
+        <w:tblInd w:type="dxa" w:w="4673"/>
+        <w:tblBorders>
+          <w:top w:val="none" w:color="FFFFFF" w:sz="0"/>
+          <w:left w:val="none" w:color="FFFFFF" w:sz="0"/>
+          <w:bottom w:val="none" w:color="FFFFFF" w:sz="0"/>
+          <w:right w:val="none" w:color="FFFFFF" w:sz="0"/>
+          <w:insideH w:val="single" w:color="auto" w:sz="4"/>
+          <w:insideV w:val="single" w:color="auto" w:sz="4"/>
+        </w:tblBorders>
+      </w:tblPr>
+      <w:tblGrid>
+        <w:gridCol w:w="100"/>
+      </w:tblGrid>
+      <w:tr>
+        <w:tc>
+          <w:tcPr>
+            <w:tcW w:type="dxa" w:w="3254"/>
+            <w:tcBorders>
+              <w:top w:val="none" w:color="FFFFFF" w:sz="0"/>
+              <w:left w:val="none" w:color="FFFFFF" w:sz="0"/>
+              <w:bottom w:val="none" w:color="FFFFFF" w:sz="0"/>
+              <w:right w:val="none" w:color="FFFFFF" w:sz="0"/>
+            </w:tcBorders>
+          </w:tcPr>
+          <w:p>
+            <w:pPr>
+              <w:spacing w:after="0" w:before="0" w:line="480"/>
+              <w:jc w:val="center"/>
+            </w:pPr>
+            <w:r>
+              <w:rPr>
+                <w:rFonts w:ascii="Times New Roman" w:cs="Times New Roman" w:eastAsia="Times New Roman" w:hAnsi="Times New Roman"/>
+                <w:sz w:val="24"/>
+                <w:szCs w:val="24"/>
+              </w:rPr>
+              <w:t xml:space="preserve">Pontianak, 18 Juni 2026</w:t>
+            </w:r>
+          </w:p>
+          <w:p>
+            <w:pPr>
+              <w:spacing w:after="0" w:before="0" w:line="480"/>
+              <w:jc w:val="center"/>
+            </w:pPr>
+            <w:r>
+              <w:rPr>
+                <w:rFonts w:ascii="Times New Roman" w:cs="Times New Roman" w:eastAsia="Times New Roman" w:hAnsi="Times New Roman"/>
+                <w:sz w:val="24"/>
+                <w:szCs w:val="24"/>
+              </w:rPr>
+              <w:t xml:space="preserve">Penulis</w:t>
+            </w:r>
+          </w:p>
+        </w:tc>
+      </w:tr>
+    </w:tbl>
     <w:p>
       <w:pPr>
         <w:sectPr>

</xml_diff>